<commit_message>
retire obsolete Vercel deployment plumbing
</commit_message>
<xml_diff>
--- a/docs/LUMINA-관리자-모드-사용-안내서.docx
+++ b/docs/LUMINA-관리자-모드-사용-안내서.docx
@@ -8008,7 +8008,7 @@
                 <w:sz w:val="20"/>
                 <w:szCs w:val="20"/>
               </w:rPr>
-              <w:t xml:space="preserve">Vercel Web Analytics</w:t>
+              <w:t xml:space="preserve">Umami · Neon rollup</w:t>
             </w:r>
           </w:p>
         </w:tc>
@@ -8040,7 +8040,7 @@
                 <w:sz w:val="20"/>
                 <w:szCs w:val="20"/>
               </w:rPr>
-              <w:t xml:space="preserve">live</w:t>
+              <w:t xml:space="preserve">fresh</w:t>
             </w:r>
           </w:p>
         </w:tc>
@@ -8072,7 +8072,7 @@
                 <w:sz w:val="20"/>
                 <w:szCs w:val="20"/>
               </w:rPr>
-              <w:t xml:space="preserve">원천 분석 API에서 현재 기간을 직접 조회</w:t>
+              <w:t xml:space="preserve">Umami에서 일별 집계를 읽어 Neon ops 테이블에 저장</w:t>
             </w:r>
           </w:p>
         </w:tc>
@@ -8104,7 +8104,7 @@
                 <w:sz w:val="20"/>
                 <w:szCs w:val="20"/>
               </w:rPr>
-              <w:t xml:space="preserve">당일 포함 최신 흐름을 보되, 오늘은 부분 집계임을 표시합니다.</w:t>
+              <w:t xml:space="preserve">Umami 수집 시작일과 데이터 커버리지 경계를 확인합니다.</w:t>
             </w:r>
           </w:p>
         </w:tc>
@@ -8988,17 +8988,6 @@
         </w:rPr>
         <w:t xml:space="preserve">neon/migrations/20260830000000_ops_analytics.sql</w:t>
       </w:r>
-    </w:p>
-    <w:p>
-      <w:pPr>
-        <w:pStyle w:val="ListParagraph"/>
-        <w:numPr>
-          <w:ilvl w:val="0"/>
-          <w:numId w:val="2"/>
-        </w:numPr>
-        <w:spacing w:after="150" w:line="285"/>
-        <w:ind w:left="560" w:hanging="280"/>
-      </w:pPr>
       <w:r>
         <w:rPr>
           <w:rFonts w:ascii="Malgun Gothic" w:cs="Malgun Gothic" w:eastAsia="Malgun Gothic" w:hAnsi="Malgun Gothic"/>
@@ -9011,7 +9000,46 @@
           <w:sz w:val="20"/>
           <w:szCs w:val="20"/>
         </w:rPr>
-        <w:t xml:space="preserve">스테이징에서 데이터베이스 마이그레이션을 적용하고 RLS 정책, 테이블, 함수, 권한을 확인합니다.</w:t>
+        <w:t xml:space="preserve"> 및 </w:t>
+      </w:r>
+      <w:r>
+        <w:rPr>
+          <w:rFonts w:ascii="Consolas" w:cs="Consolas" w:eastAsia="Consolas" w:hAnsi="Consolas"/>
+          <w:b w:val="false"/>
+          <w:bCs w:val="false"/>
+          <w:i w:val="false"/>
+          <w:iCs w:val="false"/>
+          <w:caps w:val="false"/>
+          <w:color w:val="244D43"/>
+          <w:sz w:val="18"/>
+          <w:szCs w:val="18"/>
+        </w:rPr>
+        <w:t xml:space="preserve">neon/migrations/20260926000000_ops_job_worker_and_related_click.sql</w:t>
+      </w:r>
+    </w:p>
+    <w:p>
+      <w:pPr>
+        <w:pStyle w:val="ListParagraph"/>
+        <w:numPr>
+          <w:ilvl w:val="0"/>
+          <w:numId w:val="2"/>
+        </w:numPr>
+        <w:spacing w:after="150" w:line="285"/>
+        <w:ind w:left="560" w:hanging="280"/>
+      </w:pPr>
+      <w:r>
+        <w:rPr>
+          <w:rFonts w:ascii="Malgun Gothic" w:cs="Malgun Gothic" w:eastAsia="Malgun Gothic" w:hAnsi="Malgun Gothic"/>
+          <w:b w:val="false"/>
+          <w:bCs w:val="false"/>
+          <w:i w:val="false"/>
+          <w:iCs w:val="false"/>
+          <w:caps w:val="false"/>
+          <w:color w:val="313936"/>
+          <w:sz w:val="20"/>
+          <w:szCs w:val="20"/>
+        </w:rPr>
+        <w:t xml:space="preserve">스테이징에서 먼저 dry-run과 DB 검토를 수행하고, 승인된 변경 절차로 마이그레이션을 적용한 뒤 RLS 정책, 테이블, 함수, 권한을 확인합니다.</w:t>
       </w:r>
     </w:p>
     <w:p>
@@ -9095,7 +9123,7 @@
           <w:sz w:val="20"/>
           <w:szCs w:val="20"/>
         </w:rPr>
-        <w:t xml:space="preserve">Vercel Production의 서버 전용 환경 변수에 프로젝트 ID, 분석 읽기 토큰, Cron 비밀값, 롤업 전용 DB 연결을 등록합니다.</w:t>
+        <w:t xml:space="preserve">Railway Production의 서버 전용 환경 변수에 APP_ENV=production, Umami API URL·API 키·Website ID, Cron 비밀값, lumina_jobs_worker 롤업 DB 연결과 운영 Neon endpoint ID를 등록합니다. 비밀값을 NEXT_PUBLIC_*에 두지 않습니다.</w:t>
       </w:r>
     </w:p>
     <w:p>
@@ -9285,7 +9313,7 @@
                 <w:sz w:val="18"/>
                 <w:szCs w:val="18"/>
               </w:rPr>
-              <w:t xml:space="preserve">VERCEL_PROJECT_ID</w:t>
+              <w:t xml:space="preserve">APP_ENV</w:t>
             </w:r>
           </w:p>
         </w:tc>
@@ -9317,7 +9345,7 @@
                 <w:sz w:val="20"/>
                 <w:szCs w:val="20"/>
               </w:rPr>
-              <w:t xml:space="preserve">Vercel 분석 프로젝트 식별자</w:t>
+              <w:t xml:space="preserve">Railway 환경 식별자입니다. 웹 writer는 production에서만 동작합니다.</w:t>
             </w:r>
           </w:p>
         </w:tc>
@@ -9354,7 +9382,7 @@
                 <w:sz w:val="18"/>
                 <w:szCs w:val="18"/>
               </w:rPr>
-              <w:t xml:space="preserve">VERCEL_ANALYTICS_READ_TOKEN</w:t>
+              <w:t xml:space="preserve">INTERNAL_WEB_ORIGIN</w:t>
             </w:r>
           </w:p>
         </w:tc>
@@ -9386,7 +9414,7 @@
                 <w:sz w:val="20"/>
                 <w:szCs w:val="20"/>
               </w:rPr>
-              <w:t xml:space="preserve">Vercel Web Analytics 읽기 토큰. 서버 전용이며 NEXT_PUBLIC_*로 만들지 않습니다.</w:t>
+              <w:t xml:space="preserve">cron에서 web endpoint를 호출하는 HTTPS 또는 사설 Railway origin입니다.</w:t>
             </w:r>
           </w:p>
         </w:tc>
@@ -9423,7 +9451,7 @@
                 <w:sz w:val="18"/>
                 <w:szCs w:val="18"/>
               </w:rPr>
-              <w:t xml:space="preserve">CRON_SECRET</w:t>
+              <w:t xml:space="preserve">UMAMI_API_URL</w:t>
             </w:r>
           </w:p>
         </w:tc>
@@ -9455,7 +9483,7 @@
                 <w:sz w:val="20"/>
                 <w:szCs w:val="20"/>
               </w:rPr>
-              <w:t xml:space="preserve">내부 롤업 호출을 인증하는 비밀값. 길이·보관·교체 정책을 따릅니다.</w:t>
+              <w:t xml:space="preserve">Railway Umami의 API base URL. HTTPS 또는 사설 Railway 네트워크만 허용합니다.</w:t>
             </w:r>
           </w:p>
         </w:tc>
@@ -9492,7 +9520,7 @@
                 <w:sz w:val="18"/>
                 <w:szCs w:val="18"/>
               </w:rPr>
-              <w:t xml:space="preserve">ANALYTICS_ROLLUP_DATABASE_URL</w:t>
+              <w:t xml:space="preserve">UMAMI_API_KEY</w:t>
             </w:r>
           </w:p>
         </w:tc>
@@ -9524,7 +9552,7 @@
                 <w:sz w:val="20"/>
                 <w:szCs w:val="20"/>
               </w:rPr>
-              <w:t xml:space="preserve">Cron 롤업 전용 관리자 DB 연결. 서버 환경에만 둡니다.</w:t>
+              <w:t xml:space="preserve">Umami Website 조회 API 키. 서버 전용이며 NEXT_PUBLIC_*로 만들지 않습니다.</w:t>
             </w:r>
           </w:p>
         </w:tc>
@@ -9561,7 +9589,7 @@
                 <w:sz w:val="18"/>
                 <w:szCs w:val="18"/>
               </w:rPr>
-              <w:t xml:space="preserve">VERCEL_ANALYTICS_ENVIRONMENT</w:t>
+              <w:t xml:space="preserve">UMAMI_WEBSITE_ID</w:t>
             </w:r>
           </w:p>
         </w:tc>
@@ -9593,7 +9621,7 @@
                 <w:sz w:val="20"/>
                 <w:szCs w:val="20"/>
               </w:rPr>
-              <w:t xml:space="preserve">production 전용 가드입니다. preview/staging 등 비생산 값이면 writer가 실행을 거부하며, reader도 production 행만 읽습니다.</w:t>
+              <w:t xml:space="preserve">서버 롤업이 조회할 Umami Website UUID입니다.</w:t>
             </w:r>
           </w:p>
         </w:tc>
@@ -9630,22 +9658,63 @@
                 <w:sz w:val="18"/>
                 <w:szCs w:val="18"/>
               </w:rPr>
-              <w:t xml:space="preserve">VERCEL_TEAM_ID</w:t>
-            </w:r>
-            <w:r>
-              <w:rPr>
-                <w:rFonts w:ascii="Malgun Gothic" w:cs="Malgun Gothic" w:eastAsia="Malgun Gothic" w:hAnsi="Malgun Gothic"/>
-                <w:b w:val="false"/>
-                <w:bCs w:val="false"/>
-                <w:i w:val="false"/>
-                <w:iCs w:val="false"/>
-                <w:caps w:val="false"/>
-                <w:color w:val="313936"/>
-                <w:sz w:val="20"/>
-                <w:szCs w:val="20"/>
-              </w:rPr>
-              <w:t xml:space="preserve"> / </w:t>
-            </w:r>
+              <w:t xml:space="preserve">NEXT_PUBLIC_UMAMI_SCRIPT_URL</w:t>
+            </w:r>
+          </w:p>
+        </w:tc>
+        <w:tc>
+          <w:tcPr>
+            <w:tcW w:type="dxa" w:w="6806"/>
+            <w:shd w:fill="FFFFFF" w:val="clear"/>
+            <w:tcMar>
+              <w:top w:type="dxa" w:w="110"/>
+              <w:left w:type="dxa" w:w="145"/>
+              <w:bottom w:type="dxa" w:w="110"/>
+              <w:right w:type="dxa" w:w="145"/>
+            </w:tcMar>
+            <w:vAlign w:val="center"/>
+          </w:tcPr>
+          <w:p>
+            <w:pPr>
+              <w:spacing w:after="45" w:line="250"/>
+            </w:pPr>
+            <w:r>
+              <w:rPr>
+                <w:rFonts w:ascii="Malgun Gothic" w:cs="Malgun Gothic" w:eastAsia="Malgun Gothic" w:hAnsi="Malgun Gothic"/>
+                <w:b w:val="false"/>
+                <w:bCs w:val="false"/>
+                <w:i w:val="false"/>
+                <w:iCs w:val="false"/>
+                <w:caps w:val="false"/>
+                <w:color w:val="313936"/>
+                <w:sz w:val="20"/>
+                <w:szCs w:val="20"/>
+              </w:rPr>
+              <w:t xml:space="preserve">동의 선택 후에만 불러오는 Umami script.js HTTPS URL입니다.</w:t>
+            </w:r>
+          </w:p>
+        </w:tc>
+      </w:tr>
+      <w:tr>
+        <w:trPr>
+          <w:cantSplit/>
+        </w:trPr>
+        <w:tc>
+          <w:tcPr>
+            <w:tcW w:type="dxa" w:w="3300"/>
+            <w:shd w:fill="F1F4F0" w:val="clear"/>
+            <w:tcMar>
+              <w:top w:type="dxa" w:w="110"/>
+              <w:left w:type="dxa" w:w="145"/>
+              <w:bottom w:type="dxa" w:w="110"/>
+              <w:right w:type="dxa" w:w="145"/>
+            </w:tcMar>
+            <w:vAlign w:val="center"/>
+          </w:tcPr>
+          <w:p>
+            <w:pPr>
+              <w:spacing w:after="45" w:line="250"/>
+            </w:pPr>
             <w:r>
               <w:rPr>
                 <w:rFonts w:ascii="Consolas" w:cs="Consolas" w:eastAsia="Consolas" w:hAnsi="Consolas"/>
@@ -9658,7 +9727,7 @@
                 <w:sz w:val="18"/>
                 <w:szCs w:val="18"/>
               </w:rPr>
-              <w:t xml:space="preserve">VERCEL_TEAM_SLUG</w:t>
+              <w:t xml:space="preserve">NEXT_PUBLIC_UMAMI_WEBSITE_ID</w:t>
             </w:r>
           </w:p>
         </w:tc>
@@ -9690,7 +9759,214 @@
                 <w:sz w:val="20"/>
                 <w:szCs w:val="20"/>
               </w:rPr>
-              <w:t xml:space="preserve">팀 범위가 필요한 경우 사용하는 선택 설정입니다.</w:t>
+              <w:t xml:space="preserve">브라우저 tracker Website ID. secret이 아닌 공개 ID입니다.</w:t>
+            </w:r>
+          </w:p>
+        </w:tc>
+      </w:tr>
+      <w:tr>
+        <w:trPr>
+          <w:cantSplit/>
+        </w:trPr>
+        <w:tc>
+          <w:tcPr>
+            <w:tcW w:type="dxa" w:w="3300"/>
+            <w:shd w:fill="F1F4F0" w:val="clear"/>
+            <w:tcMar>
+              <w:top w:type="dxa" w:w="110"/>
+              <w:left w:type="dxa" w:w="145"/>
+              <w:bottom w:type="dxa" w:w="110"/>
+              <w:right w:type="dxa" w:w="145"/>
+            </w:tcMar>
+            <w:vAlign w:val="center"/>
+          </w:tcPr>
+          <w:p>
+            <w:pPr>
+              <w:spacing w:after="45" w:line="250"/>
+            </w:pPr>
+            <w:r>
+              <w:rPr>
+                <w:rFonts w:ascii="Consolas" w:cs="Consolas" w:eastAsia="Consolas" w:hAnsi="Consolas"/>
+                <w:b w:val="false"/>
+                <w:bCs w:val="false"/>
+                <w:i w:val="false"/>
+                <w:iCs w:val="false"/>
+                <w:caps w:val="false"/>
+                <w:color w:val="244D43"/>
+                <w:sz w:val="18"/>
+                <w:szCs w:val="18"/>
+              </w:rPr>
+              <w:t xml:space="preserve">CRON_SECRET</w:t>
+            </w:r>
+          </w:p>
+        </w:tc>
+        <w:tc>
+          <w:tcPr>
+            <w:tcW w:type="dxa" w:w="6806"/>
+            <w:shd w:fill="FFFFFF" w:val="clear"/>
+            <w:tcMar>
+              <w:top w:type="dxa" w:w="110"/>
+              <w:left w:type="dxa" w:w="145"/>
+              <w:bottom w:type="dxa" w:w="110"/>
+              <w:right w:type="dxa" w:w="145"/>
+            </w:tcMar>
+            <w:vAlign w:val="center"/>
+          </w:tcPr>
+          <w:p>
+            <w:pPr>
+              <w:spacing w:after="45" w:line="250"/>
+            </w:pPr>
+            <w:r>
+              <w:rPr>
+                <w:rFonts w:ascii="Malgun Gothic" w:cs="Malgun Gothic" w:eastAsia="Malgun Gothic" w:hAnsi="Malgun Gothic"/>
+                <w:b w:val="false"/>
+                <w:bCs w:val="false"/>
+                <w:i w:val="false"/>
+                <w:iCs w:val="false"/>
+                <w:caps w:val="false"/>
+                <w:color w:val="313936"/>
+                <w:sz w:val="20"/>
+                <w:szCs w:val="20"/>
+              </w:rPr>
+              <w:t xml:space="preserve">내부 롤업 호출을 인증하는 비밀값. 길이·보관·교체 정책을 따릅니다.</w:t>
+            </w:r>
+          </w:p>
+        </w:tc>
+      </w:tr>
+      <w:tr>
+        <w:trPr>
+          <w:cantSplit/>
+        </w:trPr>
+        <w:tc>
+          <w:tcPr>
+            <w:tcW w:type="dxa" w:w="3300"/>
+            <w:shd w:fill="F1F4F0" w:val="clear"/>
+            <w:tcMar>
+              <w:top w:type="dxa" w:w="110"/>
+              <w:left w:type="dxa" w:w="145"/>
+              <w:bottom w:type="dxa" w:w="110"/>
+              <w:right w:type="dxa" w:w="145"/>
+            </w:tcMar>
+            <w:vAlign w:val="center"/>
+          </w:tcPr>
+          <w:p>
+            <w:pPr>
+              <w:spacing w:after="45" w:line="250"/>
+            </w:pPr>
+            <w:r>
+              <w:rPr>
+                <w:rFonts w:ascii="Consolas" w:cs="Consolas" w:eastAsia="Consolas" w:hAnsi="Consolas"/>
+                <w:b w:val="false"/>
+                <w:bCs w:val="false"/>
+                <w:i w:val="false"/>
+                <w:iCs w:val="false"/>
+                <w:caps w:val="false"/>
+                <w:color w:val="244D43"/>
+                <w:sz w:val="18"/>
+                <w:szCs w:val="18"/>
+              </w:rPr>
+              <w:t xml:space="preserve">ANALYTICS_ROLLUP_DATABASE_URL</w:t>
+            </w:r>
+          </w:p>
+        </w:tc>
+        <w:tc>
+          <w:tcPr>
+            <w:tcW w:type="dxa" w:w="6806"/>
+            <w:shd w:fill="FFFFFF" w:val="clear"/>
+            <w:tcMar>
+              <w:top w:type="dxa" w:w="110"/>
+              <w:left w:type="dxa" w:w="145"/>
+              <w:bottom w:type="dxa" w:w="110"/>
+              <w:right w:type="dxa" w:w="145"/>
+            </w:tcMar>
+            <w:vAlign w:val="center"/>
+          </w:tcPr>
+          <w:p>
+            <w:pPr>
+              <w:spacing w:after="45" w:line="250"/>
+            </w:pPr>
+            <w:r>
+              <w:rPr>
+                <w:rFonts w:ascii="Malgun Gothic" w:cs="Malgun Gothic" w:eastAsia="Malgun Gothic" w:hAnsi="Malgun Gothic"/>
+                <w:b w:val="false"/>
+                <w:bCs w:val="false"/>
+                <w:i w:val="false"/>
+                <w:iCs w:val="false"/>
+                <w:caps w:val="false"/>
+                <w:color w:val="313936"/>
+                <w:sz w:val="20"/>
+                <w:szCs w:val="20"/>
+              </w:rPr>
+              <w:t xml:space="preserve">lumina_jobs_worker 전용 Neon DB 연결. 서버 환경에만 둡니다.</w:t>
+            </w:r>
+          </w:p>
+        </w:tc>
+      </w:tr>
+      <w:tr>
+        <w:trPr>
+          <w:cantSplit/>
+        </w:trPr>
+        <w:tc>
+          <w:tcPr>
+            <w:tcW w:type="dxa" w:w="3300"/>
+            <w:shd w:fill="F1F4F0" w:val="clear"/>
+            <w:tcMar>
+              <w:top w:type="dxa" w:w="110"/>
+              <w:left w:type="dxa" w:w="145"/>
+              <w:bottom w:type="dxa" w:w="110"/>
+              <w:right w:type="dxa" w:w="145"/>
+            </w:tcMar>
+            <w:vAlign w:val="center"/>
+          </w:tcPr>
+          <w:p>
+            <w:pPr>
+              <w:spacing w:after="45" w:line="250"/>
+            </w:pPr>
+            <w:r>
+              <w:rPr>
+                <w:rFonts w:ascii="Consolas" w:cs="Consolas" w:eastAsia="Consolas" w:hAnsi="Consolas"/>
+                <w:b w:val="false"/>
+                <w:bCs w:val="false"/>
+                <w:i w:val="false"/>
+                <w:iCs w:val="false"/>
+                <w:caps w:val="false"/>
+                <w:color w:val="244D43"/>
+                <w:sz w:val="18"/>
+                <w:szCs w:val="18"/>
+              </w:rPr>
+              <w:t xml:space="preserve">ANALYTICS_ROLLUP_PRODUCTION_ENDPOINT_ID</w:t>
+            </w:r>
+          </w:p>
+        </w:tc>
+        <w:tc>
+          <w:tcPr>
+            <w:tcW w:type="dxa" w:w="6806"/>
+            <w:shd w:fill="FFFFFF" w:val="clear"/>
+            <w:tcMar>
+              <w:top w:type="dxa" w:w="110"/>
+              <w:left w:type="dxa" w:w="145"/>
+              <w:bottom w:type="dxa" w:w="110"/>
+              <w:right w:type="dxa" w:w="145"/>
+            </w:tcMar>
+            <w:vAlign w:val="center"/>
+          </w:tcPr>
+          <w:p>
+            <w:pPr>
+              <w:spacing w:after="45" w:line="250"/>
+            </w:pPr>
+            <w:r>
+              <w:rPr>
+                <w:rFonts w:ascii="Malgun Gothic" w:cs="Malgun Gothic" w:eastAsia="Malgun Gothic" w:hAnsi="Malgun Gothic"/>
+                <w:b w:val="false"/>
+                <w:bCs w:val="false"/>
+                <w:i w:val="false"/>
+                <w:iCs w:val="false"/>
+                <w:caps w:val="false"/>
+                <w:color w:val="313936"/>
+                <w:sz w:val="20"/>
+                <w:szCs w:val="20"/>
+              </w:rPr>
+              <w:t xml:space="preserve">운영 Neon endpoint ID와 URL host를 비교하는 서버 전용 가드입니다.</w:t>
             </w:r>
           </w:p>
         </w:tc>
@@ -9834,7 +10110,7 @@
           <w:sz w:val="21"/>
           <w:szCs w:val="21"/>
         </w:rPr>
-        <w:t xml:space="preserve">대시보드는 Vercel Web Analytics 라이브 조회를 우선 사용하고, 원천 API가 없거나 일시적으로 실패하면 Neon 집계 롤업을 사용합니다.</w:t>
+        <w:t xml:space="preserve">현재 대시보드는 Umami 집계를 Neon에 저장해 조회합니다. 첫 Umami 수집일과 데이터 커버리지를 표시합니다. Vercel 프로젝트는 제거되어 Vercel 집계로 되돌리는 경로는 없습니다.</w:t>
       </w:r>
     </w:p>
     <w:p>
@@ -9880,7 +10156,7 @@
           <w:sz w:val="20"/>
           <w:szCs w:val="20"/>
         </w:rPr>
-        <w:t xml:space="preserve">Vercel Cron이 내부 경로 </w:t>
+        <w:t xml:space="preserve">Railway cron-daily 서비스가 내부 경로 </w:t>
       </w:r>
     </w:p>
     <w:p>
@@ -10015,7 +10291,7 @@
           <w:sz w:val="23"/>
           <w:szCs w:val="23"/>
         </w:rPr>
-        <w:t xml:space="preserve">10.2 초기 수동 보정</w:t>
+        <w:t xml:space="preserve">10.2 롤업 보정 요청</w:t>
       </w:r>
     </w:p>
     <w:p>
@@ -10040,7 +10316,7 @@
           <w:sz w:val="20"/>
           <w:szCs w:val="20"/>
         </w:rPr>
-        <w:t xml:space="preserve">승인된 admin 환경을 선택하고, 운영 대상이라면 운영 실행 허용 절차를 확인합니다.</w:t>
+        <w:t xml:space="preserve">cron-daily는 매일 Umami에서 최근 3일을 다시 수집합니다. 대시보드 새로고침은 원천 집계를 다시 수집하지 않습니다.</w:t>
       </w:r>
     </w:p>
     <w:p>
@@ -10065,91 +10341,7 @@
           <w:sz w:val="20"/>
           <w:szCs w:val="20"/>
         </w:rPr>
-        <w:t xml:space="preserve">최대 31일 범위 안에서 시작일과 종료일을 지정합니다.</w:t>
-      </w:r>
-    </w:p>
-    <w:p>
-      <w:pPr>
-        <w:spacing w:after="100"/>
-        <w:ind w:left="840"/>
-      </w:pPr>
-      <w:r>
-        <w:rPr>
-          <w:rFonts w:ascii="Malgun Gothic" w:cs="Malgun Gothic" w:eastAsia="Malgun Gothic" w:hAnsi="Malgun Gothic"/>
-          <w:b/>
-          <w:bCs/>
-          <w:i w:val="false"/>
-          <w:iCs w:val="false"/>
-          <w:caps w:val="false"/>
-          <w:color w:val="313936"/>
-          <w:sz w:val="20"/>
-          <w:szCs w:val="20"/>
-        </w:rPr>
-        <w:t xml:space="preserve">명령 형식 예시: </w:t>
-      </w:r>
-      <w:r>
-        <w:rPr>
-          <w:rFonts w:ascii="Consolas" w:cs="Consolas" w:eastAsia="Consolas" w:hAnsi="Consolas"/>
-          <w:b w:val="false"/>
-          <w:bCs w:val="false"/>
-          <w:i w:val="false"/>
-          <w:iCs w:val="false"/>
-          <w:caps w:val="false"/>
-          <w:color w:val="244D43"/>
-          <w:sz w:val="18"/>
-          <w:szCs w:val="18"/>
-        </w:rPr>
-        <w:t xml:space="preserve">pnpm db:neon:analytics-rollup -- --since=YYYY-MM-DD --until=YYYY-MM-DD</w:t>
-      </w:r>
-    </w:p>
-    <w:p>
-      <w:pPr>
-        <w:pStyle w:val="ListParagraph"/>
-        <w:numPr>
-          <w:ilvl w:val="0"/>
-          <w:numId w:val="2"/>
-        </w:numPr>
-        <w:spacing w:after="150" w:line="285"/>
-        <w:ind w:left="560" w:hanging="280"/>
-      </w:pPr>
-      <w:r>
-        <w:rPr>
-          <w:rFonts w:ascii="Malgun Gothic" w:cs="Malgun Gothic" w:eastAsia="Malgun Gothic" w:hAnsi="Malgun Gothic"/>
-          <w:b w:val="false"/>
-          <w:bCs w:val="false"/>
-          <w:i w:val="false"/>
-          <w:iCs w:val="false"/>
-          <w:caps w:val="false"/>
-          <w:color w:val="313936"/>
-          <w:sz w:val="20"/>
-          <w:szCs w:val="20"/>
-        </w:rPr>
-        <w:t xml:space="preserve">완료 후 대시보드의 출처·신선도·커버리지를 다시 확인합니다.</w:t>
-      </w:r>
-    </w:p>
-    <w:p>
-      <w:pPr>
-        <w:pStyle w:val="ListParagraph"/>
-        <w:numPr>
-          <w:ilvl w:val="0"/>
-          <w:numId w:val="2"/>
-        </w:numPr>
-        <w:spacing w:after="150" w:line="285"/>
-        <w:ind w:left="560" w:hanging="280"/>
-      </w:pPr>
-      <w:r>
-        <w:rPr>
-          <w:rFonts w:ascii="Malgun Gothic" w:cs="Malgun Gothic" w:eastAsia="Malgun Gothic" w:hAnsi="Malgun Gothic"/>
-          <w:b w:val="false"/>
-          <w:bCs w:val="false"/>
-          <w:i w:val="false"/>
-          <w:iCs w:val="false"/>
-          <w:caps w:val="false"/>
-          <w:color w:val="313936"/>
-          <w:sz w:val="20"/>
-          <w:szCs w:val="20"/>
-        </w:rPr>
-        <w:t xml:space="preserve">실패했다면 비밀값을 로그로 복사하지 말고, 동기화 상태·발생 시각·범위만 전달합니다.</w:t>
+        <w:t xml:space="preserve">최근 3일보다 오래된 누락·불일치는 현재 제공되는 수동 backfill CLI가 없습니다. 원천, 날짜 범위, 대시보드 커버리지를 기록하고 승인된 별도 보정 절차를 요청합니다. Neon 운영 DB를 직접 수정하지 않습니다.</w:t>
       </w:r>
     </w:p>
     <w:p>
@@ -13860,7 +14052,7 @@
           <w:sz w:val="20"/>
           <w:szCs w:val="20"/>
         </w:rPr>
-        <w:t xml:space="preserve">비밀 인증 헤더가 없는 요청을 거부하는 정상적인 보호 동작입니다. 브라우저에서 토큰을 직접 시험하지 말고, Vercel Cron 설정과 운영 동기화 기록을 권한 있는 담당자가 확인합니다.</w:t>
+        <w:t xml:space="preserve">비밀 인증 헤더가 없는 요청을 거부하는 정상적인 보호 동작입니다. 브라우저에서 토큰을 직접 시험하지 말고, Railway Cron 설정과 운영 동기화 기록을 권한 있는 담당자가 확인합니다.</w:t>
       </w:r>
     </w:p>
     <w:p>
@@ -14917,7 +15109,7 @@
                 <w:sz w:val="18"/>
                 <w:szCs w:val="18"/>
               </w:rPr>
-              <w:t xml:space="preserve">node --check scripts/neon-analytics-rollup.mjs</w:t>
+              <w:t xml:space="preserve">node --check scripts/railway-analytics-rollup.mjs</w:t>
             </w:r>
           </w:p>
         </w:tc>
@@ -15063,7 +15255,7 @@
                 <w:sz w:val="21"/>
                 <w:szCs w:val="21"/>
               </w:rPr>
-              <w:t xml:space="preserve">v1.0 · 2026-08-31</w:t>
+              <w:t xml:space="preserve">v1.1 · 2026-09-28</w:t>
             </w:r>
           </w:p>
           <w:p>

</xml_diff>